<commit_message>
added assignment of 7th module
</commit_message>
<xml_diff>
--- a/Module_03_Network Addressing and Basic Configuration/Sl.docx
+++ b/Module_03_Network Addressing and Basic Configuration/Sl.docx
@@ -104,7 +104,22 @@
           </w:tcPr>
           <w:p>
             <w:r>
-              <w:t>10.0.0.1</w:t>
+              <w:t>192</w:t>
+            </w:r>
+            <w:r>
+              <w:t>.</w:t>
+            </w:r>
+            <w:r>
+              <w:t>168</w:t>
+            </w:r>
+            <w:r>
+              <w:t>.</w:t>
+            </w:r>
+            <w:r>
+              <w:t>1</w:t>
+            </w:r>
+            <w:r>
+              <w:t>0.1</w:t>
             </w:r>
           </w:p>
         </w:tc>
@@ -148,7 +163,13 @@
           </w:tcPr>
           <w:p>
             <w:r>
-              <w:t>20.0.0.1</w:t>
+              <w:t>192.168.</w:t>
+            </w:r>
+            <w:r>
+              <w:t>2</w:t>
+            </w:r>
+            <w:r>
+              <w:t>0.1</w:t>
             </w:r>
           </w:p>
         </w:tc>
@@ -192,7 +213,13 @@
           </w:tcPr>
           <w:p>
             <w:r>
-              <w:t>30.0.0.1</w:t>
+              <w:t>192.168.</w:t>
+            </w:r>
+            <w:r>
+              <w:t>3</w:t>
+            </w:r>
+            <w:r>
+              <w:t>0.1</w:t>
             </w:r>
           </w:p>
         </w:tc>
@@ -236,7 +263,13 @@
           </w:tcPr>
           <w:p>
             <w:r>
-              <w:t>40.0.0.1</w:t>
+              <w:t>192.168.</w:t>
+            </w:r>
+            <w:r>
+              <w:t>4</w:t>
+            </w:r>
+            <w:r>
+              <w:t>0.1</w:t>
             </w:r>
           </w:p>
         </w:tc>
@@ -283,7 +316,13 @@
           </w:tcPr>
           <w:p>
             <w:r>
-              <w:t>50.0.0.1</w:t>
+              <w:t>192.168.</w:t>
+            </w:r>
+            <w:r>
+              <w:t>5</w:t>
+            </w:r>
+            <w:r>
+              <w:t>0.1</w:t>
             </w:r>
           </w:p>
         </w:tc>
@@ -330,7 +369,13 @@
           </w:tcPr>
           <w:p>
             <w:r>
-              <w:t>60.0.0.1</w:t>
+              <w:t>192.168.</w:t>
+            </w:r>
+            <w:r>
+              <w:t>6</w:t>
+            </w:r>
+            <w:r>
+              <w:t>0.1</w:t>
             </w:r>
           </w:p>
         </w:tc>
@@ -950,6 +995,7 @@
   <w:style w:type="character" w:default="1" w:styleId="DefaultParagraphFont">
     <w:name w:val="Default Paragraph Font"/>
     <w:uiPriority w:val="1"/>
+    <w:semiHidden/>
     <w:unhideWhenUsed/>
   </w:style>
   <w:style w:type="table" w:default="1" w:styleId="TableNormal">

</xml_diff>